<commit_message>
wip: sauvegarde de l'état actuel (fixes DB, charte, i18n editor)
</commit_message>
<xml_diff>
--- a/local_storage/tenants/11111111-1111-1111-1111-111111111111/exports/33333333-3333-3333-3333-333333333333/memoire_technique_33333333.docx
+++ b/local_storage/tenants/11111111-1111-1111-1111-111111111111/exports/33333333-3333-3333-3333-333333333333/memoire_technique_33333333.docx
@@ -34,7 +34,7 @@
         </w:rPr>
         <w:t>MÉMOIRE TECHNIQUE JUSTIFICATIF</w:t>
         <w:br/>
-        <w:t>LYCÉE HQE PARIS</w:t>
+        <w:t>PROJET LYCÉE HQE - EIFFABTP</w:t>
         <w:br/>
       </w:r>
     </w:p>
@@ -55,7 +55,7 @@
         </w:rPr>
         <w:t>Réf. Consultation : AO-2026-LYCEE</w:t>
         <w:br/>
-        <w:t>Maître d'Ouvrage : Région IDF</w:t>
+        <w:t>Maître d'Ouvrage : Métropole Grand Paris</w:t>
         <w:br/>
         <w:t>Lot : Lot 01</w:t>
         <w:br/>

</xml_diff>